<commit_message>
micro1: add interview prep; surface PowerPoint/deck skill (fit 64->73)
Josh confirmed strong deck-building expertise, substantiating the role's
#1 required skill. Updated resume (PowerPoint + executive deck design),
fit score 64->73, match report, and added a grounded interview-prep brief.

Co-Authored-By: Claude Opus 4.8 <noreply@anthropic.com>
Claude-Session: https://claude.ai/code/session_01XNXFguRBAfdeYmwKktthiA
</commit_message>
<xml_diff>
--- a/applications/micro1-marketing-strategy-consultant/resume.docx
+++ b/applications/micro1-marketing-strategy-consultant/resume.docx
@@ -80,7 +80,7 @@
           <w:i w:val="0"/>
           <w:color w:val="1A1A1A"/>
         </w:rPr>
-        <w:t>Marketing strategist and storytelling consultant with 15+ years building full-funnel marketing strategy, brand narratives, and executive-ready communications across SaaS, MarTech, and agency environments. Translates complex business ideas, data, and research into clear, compelling narratives that drive stakeholder buy-in — from QBRs and executive reporting to thought leadership and campaign storytelling. Founder of Solenzo, advising B2B and service brands on marketing strategy, branding, and business operations, with a sharp eye for structure, messaging, and audience engagement.</w:t>
+        <w:t>Marketing strategist and storytelling consultant with 15+ years building full-funnel marketing strategy, brand narratives, and high-impact executive presentations across SaaS, MarTech, and agency environments. Designs and delivers polished decks that turn complex business ideas, data, and research into clear visual narratives that drive stakeholder buy-in — from QBRs and executive reporting to thought leadership and campaign storytelling. Founder of Solenzo, advising B2B and service brands on marketing strategy, branding, and business operations, with a sharp eye for structure, messaging, and audience engagement.</w:t>
       </w:r>
     </w:p>
     <w:p>
@@ -201,7 +201,7 @@
           <w:i w:val="0"/>
           <w:color w:val="1A1A1A"/>
         </w:rPr>
-        <w:t>Translate complex marketing and operational data, research, and insights into clear, compelling narratives and recommendations that drive stakeholder buy-in.</w:t>
+        <w:t>Translate complex marketing and operational data, research, and insights into clear, compelling executive presentations, narratives, and recommendations that drive stakeholder buy-in.</w:t>
       </w:r>
     </w:p>
     <w:p>
@@ -399,7 +399,7 @@
           <w:i w:val="0"/>
           <w:color w:val="1A1A1A"/>
         </w:rPr>
-        <w:t>Built campaign performance reporting and QBRs tracking ROI, CAC, LTV, and conversion KPIs, presenting optimization recommendations to clients.</w:t>
+        <w:t>Designed and presented executive QBR decks and performance reporting — ROI, CAC, LTV, and conversion KPIs — translating data into recommendations that drove client buy-in.</w:t>
       </w:r>
     </w:p>
     <w:p>
@@ -1060,7 +1060,7 @@
           <w:i w:val="0"/>
           <w:color w:val="1A1A1A"/>
         </w:rPr>
-        <w:t xml:space="preserve">Executive Communication:  </w:t>
+        <w:t xml:space="preserve">Presentations &amp; Executive Communication:  </w:t>
       </w:r>
       <w:r>
         <w:rPr>
@@ -1069,7 +1069,7 @@
           <w:i w:val="0"/>
           <w:color w:val="1A1A1A"/>
         </w:rPr>
-        <w:t>Executive Presentations &amp; Decks, Data Storytelling, QBRs, Stakeholder Buy-In, Technical Translation, Visual Narrative</w:t>
+        <w:t>Microsoft PowerPoint, Executive Deck Design, Data Storytelling, Visual Narrative, QBRs, Stakeholder Buy-In</w:t>
       </w:r>
     </w:p>
     <w:p>
@@ -1138,7 +1138,7 @@
           <w:i w:val="0"/>
           <w:color w:val="1A1A1A"/>
         </w:rPr>
-        <w:t>Google Workspace (Slides), HubSpot, Salesforce, Notion, Asana, Slack, Claude, ChatGPT</w:t>
+        <w:t>Microsoft PowerPoint, Google Workspace (Slides), HubSpot, Salesforce, Notion, Asana, Claude, ChatGPT</w:t>
       </w:r>
     </w:p>
     <w:p>

</xml_diff>

<commit_message>
Build deck/presentation experience into master profile + sales/channel roles
Added PowerPoint, executive deck design, and data-storytelling capability
to the master profile (new competency row, summary variant, and deck
bullets across Level, Birdeye, Fetch & Funnel, Wix, Accelo, Fivestars,
Solenzo). Wove the same into the micro1 resume's sales/channel bullets.
Fit 73 -> 74.

Co-Authored-By: Claude Opus 4.8 <noreply@anthropic.com>
Claude-Session: https://claude.ai/code/session_01XNXFguRBAfdeYmwKktthiA
</commit_message>
<xml_diff>
--- a/applications/micro1-marketing-strategy-consultant/resume.docx
+++ b/applications/micro1-marketing-strategy-consultant/resume.docx
@@ -525,7 +525,7 @@
           <w:i w:val="0"/>
           <w:color w:val="1A1A1A"/>
         </w:rPr>
-        <w:t>Developed scalable communication workflows and product-training content that clarified key messages and reduced friction.</w:t>
+        <w:t>Built partner enablement and product-training decks and presentations that clarified complex concepts, accelerated adoption, and reduced onboarding friction.</w:t>
       </w:r>
     </w:p>
     <w:p>
@@ -699,7 +699,7 @@
           <w:i w:val="0"/>
           <w:color w:val="1A1A1A"/>
         </w:rPr>
-        <w:t>Proactively communicated strategy, goals, and performance to clients, presenting recommendations that accelerated results.</w:t>
+        <w:t>Built and presented growth-strategy and performance decks to clients, using data storytelling to align stakeholders and accelerate results.</w:t>
       </w:r>
     </w:p>
     <w:p>
@@ -777,7 +777,7 @@
           <w:i w:val="0"/>
           <w:color w:val="1A1A1A"/>
         </w:rPr>
-        <w:t>Managed client accounts across campaign execution and performance reporting, translating results into optimization recommendations across paid media and creative.</w:t>
+        <w:t>Managed client accounts across campaign execution and performance reporting, building client-facing presentation decks that translated results into clear optimization recommendations.</w:t>
       </w:r>
     </w:p>
     <w:p>
@@ -879,7 +879,7 @@
           <w:i w:val="0"/>
           <w:color w:val="1A1A1A"/>
         </w:rPr>
-        <w:t>Sold and scoped complex software to agencies and professional-services firms, presenting tailored solutions and ROI cases to C-suite stakeholders.</w:t>
+        <w:t>Sold and scoped complex software to agencies and professional-services firms, presenting tailored pitch decks and ROI cases to C-suite stakeholders.</w:t>
       </w:r>
     </w:p>
     <w:p>
@@ -981,7 +981,7 @@
           <w:i w:val="0"/>
           <w:color w:val="1A1A1A"/>
         </w:rPr>
-        <w:t>Ran full-cycle sales for a loyalty and marketing-automation platform targeting SMBs, developing consultative instincts around retention and messaging.</w:t>
+        <w:t>Ran full-cycle sales for a loyalty and marketing-automation platform targeting SMBs — delivering consultative sales presentations and product demos tailored to each prospect's goals.</w:t>
       </w:r>
     </w:p>
     <w:p>

</xml_diff>